<commit_message>
corrige link do repositorio no PDF de entrega
</commit_message>
<xml_diff>
--- a/document/SENTINELA_GS2026_Grupo37.docx
+++ b/document/SENTINELA_GS2026_Grupo37.docx
@@ -141,7 +141,7 @@
             <w:sz w:val="22"/>
             <w:szCs w:val="22"/>
           </w:rPr>
-          <w:t xml:space="preserve">github.com/silvioguerreiro/1TIAOS_2026_FASE_7_GS2</w:t>
+          <w:t xml:space="preserve">github.com/silvioguerreiro/silvioguerreiro-1TIAOS_2026_FASE_7_Global_Solution_2</w:t>
         </w:r>
       </w:hyperlink>
     </w:p>
@@ -5074,7 +5074,7 @@
             <w:sz w:val="22"/>
             <w:szCs w:val="22"/>
           </w:rPr>
-          <w:t xml:space="preserve">https://github.com/silvioguerreiro/1TIAOS_2026_FASE_7_GS2</w:t>
+          <w:t xml:space="preserve">https://github.com/silvioguerreiro/silvioguerreiro-1TIAOS_2026_FASE_7_Global_Solution_2</w:t>
         </w:r>
       </w:hyperlink>
     </w:p>

</xml_diff>